<commit_message>
ups to letter; will soon remove
</commit_message>
<xml_diff>
--- a/artifacts/NPJ2025/letter.docx
+++ b/artifacts/NPJ2025/letter.docx
@@ -1564,16 +1564,63 @@
           <w:sz w:val="22"/>
           <w:szCs w:val="22"/>
         </w:rPr>
-        <w:t>While she</w:t>
-      </w:r>
-      <w:r>
-        <w:rPr>
-          <w:rFonts w:ascii="Calibri" w:hAnsi="Calibri" w:cs="Calibri"/>
-          <w:color w:val="000000" w:themeColor="text1"/>
-          <w:sz w:val="22"/>
-          <w:szCs w:val="22"/>
-        </w:rPr>
-        <w:t xml:space="preserve"> is a highly esteemed member of the reading science community, she is broadly dismissive of the cognitive science </w:t>
+        <w:t>S</w:t>
+      </w:r>
+      <w:r>
+        <w:rPr>
+          <w:rFonts w:ascii="Calibri" w:hAnsi="Calibri" w:cs="Calibri"/>
+          <w:color w:val="000000" w:themeColor="text1"/>
+          <w:sz w:val="22"/>
+          <w:szCs w:val="22"/>
+        </w:rPr>
+        <w:t>he</w:t>
+      </w:r>
+      <w:r>
+        <w:rPr>
+          <w:rFonts w:ascii="Calibri" w:hAnsi="Calibri" w:cs="Calibri"/>
+          <w:color w:val="000000" w:themeColor="text1"/>
+          <w:sz w:val="22"/>
+          <w:szCs w:val="22"/>
+        </w:rPr>
+        <w:t xml:space="preserve"> is a highly esteemed member of the reading science </w:t>
+      </w:r>
+      <w:proofErr w:type="gramStart"/>
+      <w:r>
+        <w:rPr>
+          <w:rFonts w:ascii="Calibri" w:hAnsi="Calibri" w:cs="Calibri"/>
+          <w:color w:val="000000" w:themeColor="text1"/>
+          <w:sz w:val="22"/>
+          <w:szCs w:val="22"/>
+        </w:rPr>
+        <w:t>community,</w:t>
+      </w:r>
+      <w:proofErr w:type="gramEnd"/>
+      <w:r>
+        <w:rPr>
+          <w:rFonts w:ascii="Calibri" w:hAnsi="Calibri" w:cs="Calibri"/>
+          <w:color w:val="000000" w:themeColor="text1"/>
+          <w:sz w:val="22"/>
+          <w:szCs w:val="22"/>
+        </w:rPr>
+        <w:t xml:space="preserve"> </w:t>
+      </w:r>
+      <w:r>
+        <w:rPr>
+          <w:rFonts w:ascii="Calibri" w:hAnsi="Calibri" w:cs="Calibri"/>
+          <w:color w:val="000000" w:themeColor="text1"/>
+          <w:sz w:val="22"/>
+          <w:szCs w:val="22"/>
+        </w:rPr>
+        <w:t xml:space="preserve">however </w:t>
+      </w:r>
+      <w:r>
+        <w:rPr>
+          <w:rFonts w:ascii="Calibri" w:hAnsi="Calibri" w:cs="Calibri"/>
+          <w:color w:val="000000" w:themeColor="text1"/>
+          <w:sz w:val="22"/>
+          <w:szCs w:val="22"/>
+        </w:rPr>
+        <w:t xml:space="preserve">she is broadly dismissive of the cognitive science </w:t>
       </w:r>
       <w:r>
         <w:rPr>
@@ -1672,7 +1719,61 @@
           <w:sz w:val="22"/>
           <w:szCs w:val="22"/>
         </w:rPr>
-        <w:t>in an unbiased way</w:t>
+        <w:t xml:space="preserve">in </w:t>
+      </w:r>
+      <w:r>
+        <w:rPr>
+          <w:rFonts w:ascii="Calibri" w:hAnsi="Calibri" w:cs="Calibri"/>
+          <w:color w:val="000000" w:themeColor="text1"/>
+          <w:sz w:val="22"/>
+          <w:szCs w:val="22"/>
+        </w:rPr>
+        <w:t xml:space="preserve">a way that wasn’t influenced </w:t>
+      </w:r>
+      <w:r>
+        <w:rPr>
+          <w:rFonts w:ascii="Calibri" w:hAnsi="Calibri" w:cs="Calibri"/>
+          <w:color w:val="000000" w:themeColor="text1"/>
+          <w:sz w:val="22"/>
+          <w:szCs w:val="22"/>
+        </w:rPr>
+        <w:t xml:space="preserve">by her tendency </w:t>
+      </w:r>
+      <w:r>
+        <w:rPr>
+          <w:rFonts w:ascii="Calibri" w:hAnsi="Calibri" w:cs="Calibri"/>
+          <w:color w:val="000000" w:themeColor="text1"/>
+          <w:sz w:val="22"/>
+          <w:szCs w:val="22"/>
+        </w:rPr>
+        <w:t>to disregard connectionist science</w:t>
+      </w:r>
+      <w:r>
+        <w:rPr>
+          <w:rFonts w:ascii="Calibri" w:hAnsi="Calibri" w:cs="Calibri"/>
+          <w:color w:val="000000" w:themeColor="text1"/>
+          <w:sz w:val="22"/>
+          <w:szCs w:val="22"/>
+        </w:rPr>
+        <w:t>, despite the incredible impact that connectionism and related theories (</w:t>
+      </w:r>
+      <w:r>
+        <w:rPr>
+          <w:rFonts w:ascii="Calibri" w:hAnsi="Calibri" w:cs="Calibri"/>
+          <w:color w:val="000000" w:themeColor="text1"/>
+          <w:sz w:val="22"/>
+          <w:szCs w:val="22"/>
+        </w:rPr>
+        <w:t>e.g., statistical learning, dynamical systems)</w:t>
+      </w:r>
+      <w:r>
+        <w:rPr>
+          <w:rFonts w:ascii="Calibri" w:hAnsi="Calibri" w:cs="Calibri"/>
+          <w:color w:val="000000" w:themeColor="text1"/>
+          <w:sz w:val="22"/>
+          <w:szCs w:val="22"/>
+        </w:rPr>
+        <w:t xml:space="preserve"> have had on reading science and learning science more broadly</w:t>
       </w:r>
       <w:r>
         <w:rPr>

</xml_diff>